<commit_message>
Documento Historia de Usuario
</commit_message>
<xml_diff>
--- a/Documentação Hub_Escola.docx
+++ b/Documentação Hub_Escola.docx
@@ -4578,6 +4578,1657 @@
         <w:t xml:space="preserve"> a escola deve aparecer imediatamente na lista de "Escolas Cadastradas" abaixo do formulário.</w:t>
       </w:r>
     </w:p>
+    <w:p>
+      <w:pPr>
+        <w:pStyle w:val="Ttulo3"/>
+        <w:keepNext w:val="0"/>
+        <w:keepLines w:val="0"/>
+        <w:spacing w:before="0"/>
+        <w:rPr>
+          <w:b/>
+          <w:bCs/>
+          <w:color w:val="000000"/>
+          <w:sz w:val="26"/>
+          <w:szCs w:val="26"/>
+        </w:rPr>
+      </w:pPr>
+      <w:r>
+        <w:rPr>
+          <w:b/>
+          <w:bCs/>
+          <w:color w:val="000000"/>
+          <w:sz w:val="26"/>
+          <w:szCs w:val="26"/>
+        </w:rPr>
+        <w:t>História de Usuário 03: Validação de Acesso</w:t>
+      </w:r>
+    </w:p>
+    <w:p>
+      <w:pPr>
+        <w:pStyle w:val="Ttulo3"/>
+        <w:keepNext w:val="0"/>
+        <w:keepLines w:val="0"/>
+        <w:spacing w:before="0"/>
+        <w:rPr>
+          <w:color w:val="000000"/>
+          <w:sz w:val="22"/>
+          <w:szCs w:val="22"/>
+        </w:rPr>
+      </w:pPr>
+      <w:r>
+        <w:rPr>
+          <w:color w:val="000000"/>
+          <w:sz w:val="22"/>
+          <w:szCs w:val="22"/>
+        </w:rPr>
+        <w:t>Como gestor educacional,</w:t>
+      </w:r>
+      <w:r>
+        <w:rPr>
+          <w:color w:val="000000"/>
+          <w:sz w:val="22"/>
+          <w:szCs w:val="22"/>
+        </w:rPr>
+        <w:br/>
+        <w:t>Quero que o sistema valide minhas credenciais de acesso,</w:t>
+      </w:r>
+      <w:r>
+        <w:rPr>
+          <w:color w:val="000000"/>
+          <w:sz w:val="22"/>
+          <w:szCs w:val="22"/>
+        </w:rPr>
+        <w:br/>
+        <w:t>Para que apenas usuários autorizados possam utilizar a plataforma.</w:t>
+      </w:r>
+    </w:p>
+    <w:p>
+      <w:pPr>
+        <w:pStyle w:val="Ttulo3"/>
+        <w:keepNext w:val="0"/>
+        <w:keepLines w:val="0"/>
+        <w:spacing w:before="0"/>
+        <w:rPr>
+          <w:b/>
+          <w:bCs/>
+          <w:color w:val="000000"/>
+          <w:sz w:val="26"/>
+          <w:szCs w:val="26"/>
+        </w:rPr>
+      </w:pPr>
+    </w:p>
+    <w:p>
+      <w:pPr>
+        <w:pStyle w:val="Ttulo3"/>
+        <w:keepNext w:val="0"/>
+        <w:keepLines w:val="0"/>
+        <w:spacing w:before="0"/>
+        <w:rPr>
+          <w:b/>
+          <w:bCs/>
+          <w:color w:val="000000"/>
+          <w:sz w:val="22"/>
+          <w:szCs w:val="22"/>
+        </w:rPr>
+      </w:pPr>
+      <w:r>
+        <w:rPr>
+          <w:b/>
+          <w:bCs/>
+          <w:color w:val="000000"/>
+          <w:sz w:val="22"/>
+          <w:szCs w:val="22"/>
+        </w:rPr>
+        <w:t>Cenários em BDD:</w:t>
+      </w:r>
+    </w:p>
+    <w:p>
+      <w:pPr>
+        <w:pStyle w:val="Ttulo3"/>
+        <w:keepNext w:val="0"/>
+        <w:keepLines w:val="0"/>
+        <w:spacing w:before="0"/>
+        <w:ind w:left="720"/>
+        <w:rPr>
+          <w:color w:val="000000"/>
+          <w:sz w:val="22"/>
+          <w:szCs w:val="22"/>
+        </w:rPr>
+      </w:pPr>
+    </w:p>
+    <w:p>
+      <w:pPr>
+        <w:pStyle w:val="Ttulo3"/>
+        <w:keepNext w:val="0"/>
+        <w:keepLines w:val="0"/>
+        <w:spacing w:before="0"/>
+        <w:ind w:left="720"/>
+        <w:rPr>
+          <w:color w:val="000000"/>
+          <w:sz w:val="22"/>
+          <w:szCs w:val="22"/>
+        </w:rPr>
+      </w:pPr>
+      <w:r>
+        <w:rPr>
+          <w:color w:val="000000"/>
+          <w:sz w:val="22"/>
+          <w:szCs w:val="22"/>
+        </w:rPr>
+        <w:t>● Cenário 1: Login com credenciais válidas</w:t>
+      </w:r>
+    </w:p>
+    <w:p>
+      <w:pPr>
+        <w:pStyle w:val="Ttulo3"/>
+        <w:keepNext w:val="0"/>
+        <w:keepLines w:val="0"/>
+        <w:spacing w:before="0"/>
+        <w:ind w:left="1440"/>
+        <w:rPr>
+          <w:color w:val="000000"/>
+          <w:sz w:val="22"/>
+          <w:szCs w:val="22"/>
+        </w:rPr>
+      </w:pPr>
+      <w:r>
+        <w:rPr>
+          <w:color w:val="000000"/>
+          <w:sz w:val="22"/>
+          <w:szCs w:val="22"/>
+        </w:rPr>
+        <w:t>○ Dado que possuo uma conta cadastrada</w:t>
+      </w:r>
+      <w:r>
+        <w:rPr>
+          <w:color w:val="000000"/>
+          <w:sz w:val="22"/>
+          <w:szCs w:val="22"/>
+        </w:rPr>
+        <w:br/>
+        <w:t>○ Quando informo o usuário "gestor01" e a senha "senha123"</w:t>
+      </w:r>
+      <w:r>
+        <w:rPr>
+          <w:color w:val="000000"/>
+          <w:sz w:val="22"/>
+          <w:szCs w:val="22"/>
+        </w:rPr>
+        <w:br/>
+        <w:t>○ E clico em "Entrar"</w:t>
+      </w:r>
+      <w:r>
+        <w:rPr>
+          <w:color w:val="000000"/>
+          <w:sz w:val="22"/>
+          <w:szCs w:val="22"/>
+        </w:rPr>
+        <w:br/>
+        <w:t>○ Então o sistema deve autenticar meu acesso</w:t>
+      </w:r>
+      <w:r>
+        <w:rPr>
+          <w:color w:val="000000"/>
+          <w:sz w:val="22"/>
+          <w:szCs w:val="22"/>
+        </w:rPr>
+        <w:br/>
+        <w:t>○ E redirecionar para a tela principal do sistema.</w:t>
+      </w:r>
+    </w:p>
+    <w:p>
+      <w:pPr>
+        <w:pStyle w:val="Ttulo3"/>
+        <w:keepNext w:val="0"/>
+        <w:keepLines w:val="0"/>
+        <w:spacing w:before="0"/>
+        <w:ind w:left="720"/>
+        <w:rPr>
+          <w:color w:val="000000"/>
+          <w:sz w:val="22"/>
+          <w:szCs w:val="22"/>
+        </w:rPr>
+      </w:pPr>
+    </w:p>
+    <w:p>
+      <w:pPr>
+        <w:pStyle w:val="Ttulo3"/>
+        <w:keepNext w:val="0"/>
+        <w:keepLines w:val="0"/>
+        <w:spacing w:before="0"/>
+        <w:ind w:left="720"/>
+        <w:rPr>
+          <w:color w:val="000000"/>
+          <w:sz w:val="22"/>
+          <w:szCs w:val="22"/>
+        </w:rPr>
+      </w:pPr>
+      <w:r>
+        <w:rPr>
+          <w:color w:val="000000"/>
+          <w:sz w:val="22"/>
+          <w:szCs w:val="22"/>
+        </w:rPr>
+        <w:t xml:space="preserve">● </w:t>
+      </w:r>
+      <w:r>
+        <w:rPr>
+          <w:b/>
+          <w:bCs/>
+          <w:color w:val="000000"/>
+          <w:sz w:val="22"/>
+          <w:szCs w:val="22"/>
+        </w:rPr>
+        <w:t>Cenário 2: Login com senha incorreta</w:t>
+      </w:r>
+    </w:p>
+    <w:p>
+      <w:pPr>
+        <w:pStyle w:val="Ttulo3"/>
+        <w:keepNext w:val="0"/>
+        <w:keepLines w:val="0"/>
+        <w:spacing w:before="0"/>
+        <w:ind w:left="1440"/>
+        <w:rPr>
+          <w:color w:val="000000"/>
+          <w:sz w:val="22"/>
+          <w:szCs w:val="22"/>
+        </w:rPr>
+      </w:pPr>
+      <w:r>
+        <w:rPr>
+          <w:color w:val="000000"/>
+          <w:sz w:val="22"/>
+          <w:szCs w:val="22"/>
+        </w:rPr>
+        <w:lastRenderedPageBreak/>
+        <w:t>○ Dado que possuo uma conta cadastrada</w:t>
+      </w:r>
+      <w:r>
+        <w:rPr>
+          <w:color w:val="000000"/>
+          <w:sz w:val="22"/>
+          <w:szCs w:val="22"/>
+        </w:rPr>
+        <w:br/>
+        <w:t>○ Quando informo o usuário "gestor01" e a senha "</w:t>
+      </w:r>
+      <w:proofErr w:type="spellStart"/>
+      <w:r>
+        <w:rPr>
+          <w:color w:val="000000"/>
+          <w:sz w:val="22"/>
+          <w:szCs w:val="22"/>
+        </w:rPr>
+        <w:t>senhaErrada</w:t>
+      </w:r>
+      <w:proofErr w:type="spellEnd"/>
+      <w:r>
+        <w:rPr>
+          <w:color w:val="000000"/>
+          <w:sz w:val="22"/>
+          <w:szCs w:val="22"/>
+        </w:rPr>
+        <w:t>"</w:t>
+      </w:r>
+      <w:r>
+        <w:rPr>
+          <w:color w:val="000000"/>
+          <w:sz w:val="22"/>
+          <w:szCs w:val="22"/>
+        </w:rPr>
+        <w:br/>
+        <w:t>○ E clico em "Entrar"</w:t>
+      </w:r>
+      <w:r>
+        <w:rPr>
+          <w:color w:val="000000"/>
+          <w:sz w:val="22"/>
+          <w:szCs w:val="22"/>
+        </w:rPr>
+        <w:br/>
+        <w:t>○ Então o sistema deve rejeitar o login</w:t>
+      </w:r>
+      <w:r>
+        <w:rPr>
+          <w:color w:val="000000"/>
+          <w:sz w:val="22"/>
+          <w:szCs w:val="22"/>
+        </w:rPr>
+        <w:br/>
+        <w:t>○ E exibir a mensagem "Usuário ou senha inválidos".</w:t>
+      </w:r>
+    </w:p>
+    <w:p>
+      <w:pPr>
+        <w:pStyle w:val="Ttulo3"/>
+        <w:keepNext w:val="0"/>
+        <w:keepLines w:val="0"/>
+        <w:spacing w:before="0"/>
+        <w:rPr>
+          <w:b/>
+          <w:bCs/>
+          <w:color w:val="000000"/>
+          <w:sz w:val="26"/>
+          <w:szCs w:val="26"/>
+        </w:rPr>
+      </w:pPr>
+    </w:p>
+    <w:p>
+      <w:pPr>
+        <w:pStyle w:val="Ttulo3"/>
+        <w:keepNext w:val="0"/>
+        <w:keepLines w:val="0"/>
+        <w:spacing w:before="0"/>
+        <w:rPr>
+          <w:b/>
+          <w:bCs/>
+          <w:color w:val="000000"/>
+          <w:sz w:val="26"/>
+          <w:szCs w:val="26"/>
+        </w:rPr>
+      </w:pPr>
+      <w:r>
+        <w:rPr>
+          <w:b/>
+          <w:bCs/>
+          <w:color w:val="000000"/>
+          <w:sz w:val="26"/>
+          <w:szCs w:val="26"/>
+        </w:rPr>
+        <w:t>História de Usuário 04: Consulta de Escolas</w:t>
+      </w:r>
+    </w:p>
+    <w:p>
+      <w:pPr>
+        <w:pStyle w:val="Ttulo3"/>
+        <w:keepNext w:val="0"/>
+        <w:keepLines w:val="0"/>
+        <w:spacing w:before="0"/>
+        <w:rPr>
+          <w:color w:val="000000"/>
+          <w:sz w:val="22"/>
+          <w:szCs w:val="22"/>
+        </w:rPr>
+      </w:pPr>
+      <w:r>
+        <w:rPr>
+          <w:color w:val="000000"/>
+          <w:sz w:val="22"/>
+          <w:szCs w:val="22"/>
+        </w:rPr>
+        <w:t>Como gestor autenticado,</w:t>
+      </w:r>
+      <w:r>
+        <w:rPr>
+          <w:color w:val="000000"/>
+          <w:sz w:val="22"/>
+          <w:szCs w:val="22"/>
+        </w:rPr>
+        <w:br/>
+        <w:t>Quero visualizar todas as escolas cadastradas,</w:t>
+      </w:r>
+      <w:r>
+        <w:rPr>
+          <w:color w:val="000000"/>
+          <w:sz w:val="22"/>
+          <w:szCs w:val="22"/>
+        </w:rPr>
+        <w:br/>
+        <w:t>Para que eu possa acompanhar e consultar os registros da rede escolar.</w:t>
+      </w:r>
+    </w:p>
+    <w:p>
+      <w:pPr>
+        <w:pStyle w:val="Ttulo3"/>
+        <w:keepNext w:val="0"/>
+        <w:keepLines w:val="0"/>
+        <w:spacing w:before="0"/>
+        <w:rPr>
+          <w:b/>
+          <w:bCs/>
+          <w:color w:val="000000"/>
+          <w:sz w:val="22"/>
+          <w:szCs w:val="22"/>
+        </w:rPr>
+      </w:pPr>
+      <w:r>
+        <w:rPr>
+          <w:b/>
+          <w:bCs/>
+          <w:color w:val="000000"/>
+          <w:sz w:val="22"/>
+          <w:szCs w:val="22"/>
+        </w:rPr>
+        <w:t>Cenários em BDD:</w:t>
+      </w:r>
+    </w:p>
+    <w:p>
+      <w:pPr>
+        <w:pStyle w:val="Ttulo3"/>
+        <w:keepNext w:val="0"/>
+        <w:keepLines w:val="0"/>
+        <w:spacing w:before="0"/>
+        <w:ind w:left="720"/>
+        <w:rPr>
+          <w:b/>
+          <w:bCs/>
+          <w:color w:val="000000"/>
+          <w:sz w:val="22"/>
+          <w:szCs w:val="22"/>
+        </w:rPr>
+      </w:pPr>
+    </w:p>
+    <w:p>
+      <w:pPr>
+        <w:pStyle w:val="Ttulo3"/>
+        <w:keepNext w:val="0"/>
+        <w:keepLines w:val="0"/>
+        <w:spacing w:before="0"/>
+        <w:ind w:left="720"/>
+        <w:rPr>
+          <w:b/>
+          <w:bCs/>
+          <w:color w:val="000000"/>
+          <w:sz w:val="22"/>
+          <w:szCs w:val="22"/>
+        </w:rPr>
+      </w:pPr>
+      <w:r>
+        <w:rPr>
+          <w:b/>
+          <w:bCs/>
+          <w:color w:val="000000"/>
+          <w:sz w:val="22"/>
+          <w:szCs w:val="22"/>
+        </w:rPr>
+        <w:t>● Cenário 1: Exibição da lista de escolas</w:t>
+      </w:r>
+    </w:p>
+    <w:p>
+      <w:pPr>
+        <w:pStyle w:val="Ttulo3"/>
+        <w:keepNext w:val="0"/>
+        <w:keepLines w:val="0"/>
+        <w:spacing w:before="0"/>
+        <w:ind w:left="1440"/>
+        <w:rPr>
+          <w:color w:val="000000"/>
+          <w:sz w:val="22"/>
+          <w:szCs w:val="22"/>
+        </w:rPr>
+      </w:pPr>
+      <w:r>
+        <w:rPr>
+          <w:color w:val="000000"/>
+          <w:sz w:val="22"/>
+          <w:szCs w:val="22"/>
+        </w:rPr>
+        <w:t>○ Dado que estou autenticado no sistema</w:t>
+      </w:r>
+      <w:r>
+        <w:rPr>
+          <w:color w:val="000000"/>
+          <w:sz w:val="22"/>
+          <w:szCs w:val="22"/>
+        </w:rPr>
+        <w:br/>
+        <w:t>○ E existem escolas cadastradas</w:t>
+      </w:r>
+      <w:r>
+        <w:rPr>
+          <w:color w:val="000000"/>
+          <w:sz w:val="22"/>
+          <w:szCs w:val="22"/>
+        </w:rPr>
+        <w:br/>
+      </w:r>
+      <w:proofErr w:type="gramStart"/>
+      <w:r>
+        <w:rPr>
+          <w:color w:val="000000"/>
+          <w:sz w:val="22"/>
+          <w:szCs w:val="22"/>
+        </w:rPr>
+        <w:t>○ Quando</w:t>
+      </w:r>
+      <w:proofErr w:type="gramEnd"/>
+      <w:r>
+        <w:rPr>
+          <w:color w:val="000000"/>
+          <w:sz w:val="22"/>
+          <w:szCs w:val="22"/>
+        </w:rPr>
+        <w:t xml:space="preserve"> acesso a tela principal</w:t>
+      </w:r>
+      <w:r>
+        <w:rPr>
+          <w:color w:val="000000"/>
+          <w:sz w:val="22"/>
+          <w:szCs w:val="22"/>
+        </w:rPr>
+        <w:br/>
+      </w:r>
+      <w:proofErr w:type="gramStart"/>
+      <w:r>
+        <w:rPr>
+          <w:color w:val="000000"/>
+          <w:sz w:val="22"/>
+          <w:szCs w:val="22"/>
+        </w:rPr>
+        <w:t>○ Então</w:t>
+      </w:r>
+      <w:proofErr w:type="gramEnd"/>
+      <w:r>
+        <w:rPr>
+          <w:color w:val="000000"/>
+          <w:sz w:val="22"/>
+          <w:szCs w:val="22"/>
+        </w:rPr>
+        <w:t xml:space="preserve"> o sistema deve exibir todas as escolas cadastradas em uma lista.</w:t>
+      </w:r>
+    </w:p>
+    <w:p>
+      <w:pPr>
+        <w:pStyle w:val="Ttulo3"/>
+        <w:keepNext w:val="0"/>
+        <w:keepLines w:val="0"/>
+        <w:spacing w:before="0"/>
+        <w:ind w:left="720"/>
+        <w:rPr>
+          <w:color w:val="000000"/>
+          <w:sz w:val="22"/>
+          <w:szCs w:val="22"/>
+        </w:rPr>
+      </w:pPr>
+    </w:p>
+    <w:p>
+      <w:pPr>
+        <w:pStyle w:val="Ttulo3"/>
+        <w:keepNext w:val="0"/>
+        <w:keepLines w:val="0"/>
+        <w:spacing w:before="0"/>
+        <w:ind w:left="720"/>
+        <w:rPr>
+          <w:color w:val="000000"/>
+          <w:sz w:val="22"/>
+          <w:szCs w:val="22"/>
+        </w:rPr>
+      </w:pPr>
+      <w:r>
+        <w:rPr>
+          <w:color w:val="000000"/>
+          <w:sz w:val="22"/>
+          <w:szCs w:val="22"/>
+        </w:rPr>
+        <w:t xml:space="preserve">● </w:t>
+      </w:r>
+      <w:r>
+        <w:rPr>
+          <w:b/>
+          <w:bCs/>
+          <w:color w:val="000000"/>
+          <w:sz w:val="22"/>
+          <w:szCs w:val="22"/>
+        </w:rPr>
+        <w:t>Cenário 2: Lista vazia de escolas</w:t>
+      </w:r>
+    </w:p>
+    <w:p>
+      <w:pPr>
+        <w:pStyle w:val="Ttulo3"/>
+        <w:keepNext w:val="0"/>
+        <w:keepLines w:val="0"/>
+        <w:spacing w:before="0"/>
+        <w:ind w:left="1440"/>
+        <w:rPr>
+          <w:color w:val="000000"/>
+          <w:sz w:val="22"/>
+          <w:szCs w:val="22"/>
+        </w:rPr>
+      </w:pPr>
+      <w:r>
+        <w:rPr>
+          <w:color w:val="000000"/>
+          <w:sz w:val="22"/>
+          <w:szCs w:val="22"/>
+        </w:rPr>
+        <w:t>○ Dado que estou autenticado no sistema</w:t>
+      </w:r>
+      <w:r>
+        <w:rPr>
+          <w:color w:val="000000"/>
+          <w:sz w:val="22"/>
+          <w:szCs w:val="22"/>
+        </w:rPr>
+        <w:br/>
+        <w:t>○ E não existem escolas cadastradas</w:t>
+      </w:r>
+      <w:r>
+        <w:rPr>
+          <w:color w:val="000000"/>
+          <w:sz w:val="22"/>
+          <w:szCs w:val="22"/>
+        </w:rPr>
+        <w:br/>
+      </w:r>
+      <w:proofErr w:type="gramStart"/>
+      <w:r>
+        <w:rPr>
+          <w:color w:val="000000"/>
+          <w:sz w:val="22"/>
+          <w:szCs w:val="22"/>
+        </w:rPr>
+        <w:t>○ Quando</w:t>
+      </w:r>
+      <w:proofErr w:type="gramEnd"/>
+      <w:r>
+        <w:rPr>
+          <w:color w:val="000000"/>
+          <w:sz w:val="22"/>
+          <w:szCs w:val="22"/>
+        </w:rPr>
+        <w:t xml:space="preserve"> acesso a listagem de escolas</w:t>
+      </w:r>
+      <w:r>
+        <w:rPr>
+          <w:color w:val="000000"/>
+          <w:sz w:val="22"/>
+          <w:szCs w:val="22"/>
+        </w:rPr>
+        <w:br/>
+      </w:r>
+      <w:proofErr w:type="gramStart"/>
+      <w:r>
+        <w:rPr>
+          <w:color w:val="000000"/>
+          <w:sz w:val="22"/>
+          <w:szCs w:val="22"/>
+        </w:rPr>
+        <w:t>○ Então</w:t>
+      </w:r>
+      <w:proofErr w:type="gramEnd"/>
+      <w:r>
+        <w:rPr>
+          <w:color w:val="000000"/>
+          <w:sz w:val="22"/>
+          <w:szCs w:val="22"/>
+        </w:rPr>
+        <w:t xml:space="preserve"> o sistema deve exibir uma mensagem informando que não há escolas cadastradas.</w:t>
+      </w:r>
+    </w:p>
+    <w:p>
+      <w:pPr>
+        <w:pStyle w:val="Ttulo3"/>
+        <w:keepNext w:val="0"/>
+        <w:keepLines w:val="0"/>
+        <w:spacing w:before="0"/>
+        <w:rPr>
+          <w:b/>
+          <w:bCs/>
+          <w:color w:val="000000"/>
+          <w:sz w:val="26"/>
+          <w:szCs w:val="26"/>
+        </w:rPr>
+      </w:pPr>
+    </w:p>
+    <w:p>
+      <w:pPr>
+        <w:pStyle w:val="Ttulo3"/>
+        <w:keepNext w:val="0"/>
+        <w:keepLines w:val="0"/>
+        <w:spacing w:before="0"/>
+        <w:rPr>
+          <w:b/>
+          <w:bCs/>
+          <w:color w:val="000000"/>
+          <w:sz w:val="26"/>
+          <w:szCs w:val="26"/>
+        </w:rPr>
+      </w:pPr>
+      <w:r>
+        <w:rPr>
+          <w:b/>
+          <w:bCs/>
+          <w:color w:val="000000"/>
+          <w:sz w:val="26"/>
+          <w:szCs w:val="26"/>
+        </w:rPr>
+        <w:t>História de Usuário 05: Atualização de Dados da Escola</w:t>
+      </w:r>
+    </w:p>
+    <w:p>
+      <w:pPr>
+        <w:pStyle w:val="Ttulo3"/>
+        <w:keepNext w:val="0"/>
+        <w:keepLines w:val="0"/>
+        <w:spacing w:before="0"/>
+        <w:rPr>
+          <w:color w:val="000000"/>
+          <w:sz w:val="22"/>
+          <w:szCs w:val="22"/>
+        </w:rPr>
+      </w:pPr>
+      <w:r>
+        <w:rPr>
+          <w:color w:val="000000"/>
+          <w:sz w:val="22"/>
+          <w:szCs w:val="22"/>
+        </w:rPr>
+        <w:t>Como gestor autenticado,</w:t>
+      </w:r>
+      <w:r>
+        <w:rPr>
+          <w:color w:val="000000"/>
+          <w:sz w:val="22"/>
+          <w:szCs w:val="22"/>
+        </w:rPr>
+        <w:br/>
+        <w:t>Quero editar os dados de uma escola cadastrada,</w:t>
+      </w:r>
+      <w:r>
+        <w:rPr>
+          <w:color w:val="000000"/>
+          <w:sz w:val="22"/>
+          <w:szCs w:val="22"/>
+        </w:rPr>
+        <w:br/>
+        <w:t>Para que as informações permaneçam sempre atualizadas.</w:t>
+      </w:r>
+    </w:p>
+    <w:p>
+      <w:pPr>
+        <w:pStyle w:val="Ttulo3"/>
+        <w:keepNext w:val="0"/>
+        <w:keepLines w:val="0"/>
+        <w:spacing w:before="0"/>
+        <w:rPr>
+          <w:b/>
+          <w:bCs/>
+          <w:color w:val="000000"/>
+          <w:sz w:val="22"/>
+          <w:szCs w:val="22"/>
+        </w:rPr>
+      </w:pPr>
+      <w:r>
+        <w:rPr>
+          <w:b/>
+          <w:bCs/>
+          <w:color w:val="000000"/>
+          <w:sz w:val="22"/>
+          <w:szCs w:val="22"/>
+        </w:rPr>
+        <w:t>Cenários em BDD:</w:t>
+      </w:r>
+    </w:p>
+    <w:p>
+      <w:pPr>
+        <w:pStyle w:val="Ttulo3"/>
+        <w:keepNext w:val="0"/>
+        <w:keepLines w:val="0"/>
+        <w:spacing w:before="0"/>
+        <w:ind w:left="720"/>
+        <w:rPr>
+          <w:b/>
+          <w:bCs/>
+          <w:color w:val="000000"/>
+          <w:sz w:val="22"/>
+          <w:szCs w:val="22"/>
+        </w:rPr>
+      </w:pPr>
+    </w:p>
+    <w:p>
+      <w:pPr>
+        <w:pStyle w:val="Ttulo3"/>
+        <w:keepNext w:val="0"/>
+        <w:keepLines w:val="0"/>
+        <w:spacing w:before="0"/>
+        <w:ind w:left="720"/>
+        <w:rPr>
+          <w:b/>
+          <w:bCs/>
+          <w:color w:val="000000"/>
+          <w:sz w:val="22"/>
+          <w:szCs w:val="22"/>
+        </w:rPr>
+      </w:pPr>
+      <w:r>
+        <w:rPr>
+          <w:b/>
+          <w:bCs/>
+          <w:color w:val="000000"/>
+          <w:sz w:val="22"/>
+          <w:szCs w:val="22"/>
+        </w:rPr>
+        <w:t>● Cenário 1: Atualização de dados com sucesso</w:t>
+      </w:r>
+    </w:p>
+    <w:p>
+      <w:pPr>
+        <w:pStyle w:val="Ttulo3"/>
+        <w:keepNext w:val="0"/>
+        <w:keepLines w:val="0"/>
+        <w:spacing w:before="0"/>
+        <w:ind w:left="1440"/>
+        <w:rPr>
+          <w:color w:val="000000"/>
+          <w:sz w:val="22"/>
+          <w:szCs w:val="22"/>
+        </w:rPr>
+      </w:pPr>
+      <w:r>
+        <w:rPr>
+          <w:color w:val="000000"/>
+          <w:sz w:val="22"/>
+          <w:szCs w:val="22"/>
+        </w:rPr>
+        <w:t>○ Dado que estou autenticado no sistema</w:t>
+      </w:r>
+      <w:r>
+        <w:rPr>
+          <w:color w:val="000000"/>
+          <w:sz w:val="22"/>
+          <w:szCs w:val="22"/>
+        </w:rPr>
+        <w:br/>
+        <w:t>○ E existe uma escola cadastrada chamada "Escola Classe 01"</w:t>
+      </w:r>
+      <w:r>
+        <w:rPr>
+          <w:color w:val="000000"/>
+          <w:sz w:val="22"/>
+          <w:szCs w:val="22"/>
+        </w:rPr>
+        <w:br/>
+        <w:t>○ Quando altero a localidade para "Asa Sul"</w:t>
+      </w:r>
+      <w:r>
+        <w:rPr>
+          <w:color w:val="000000"/>
+          <w:sz w:val="22"/>
+          <w:szCs w:val="22"/>
+        </w:rPr>
+        <w:br/>
+        <w:t>○ E clico em "Salvar"</w:t>
+      </w:r>
+      <w:r>
+        <w:rPr>
+          <w:color w:val="000000"/>
+          <w:sz w:val="22"/>
+          <w:szCs w:val="22"/>
+        </w:rPr>
+        <w:br/>
+        <w:t>○ Então o sistema deve atualizar os dados da escola</w:t>
+      </w:r>
+      <w:r>
+        <w:rPr>
+          <w:color w:val="000000"/>
+          <w:sz w:val="22"/>
+          <w:szCs w:val="22"/>
+        </w:rPr>
+        <w:br/>
+        <w:t>○ E exibir as informações atualizadas na listagem.</w:t>
+      </w:r>
+    </w:p>
+    <w:p>
+      <w:pPr>
+        <w:pStyle w:val="Ttulo3"/>
+        <w:keepNext w:val="0"/>
+        <w:keepLines w:val="0"/>
+        <w:spacing w:before="0"/>
+        <w:ind w:left="720"/>
+        <w:rPr>
+          <w:color w:val="000000"/>
+          <w:sz w:val="22"/>
+          <w:szCs w:val="22"/>
+        </w:rPr>
+      </w:pPr>
+    </w:p>
+    <w:p>
+      <w:pPr>
+        <w:pStyle w:val="Ttulo3"/>
+        <w:keepNext w:val="0"/>
+        <w:keepLines w:val="0"/>
+        <w:spacing w:before="0"/>
+        <w:ind w:left="720"/>
+        <w:rPr>
+          <w:b/>
+          <w:bCs/>
+          <w:color w:val="000000"/>
+          <w:sz w:val="22"/>
+          <w:szCs w:val="22"/>
+        </w:rPr>
+      </w:pPr>
+      <w:r>
+        <w:rPr>
+          <w:b/>
+          <w:bCs/>
+          <w:color w:val="000000"/>
+          <w:sz w:val="22"/>
+          <w:szCs w:val="22"/>
+        </w:rPr>
+        <w:t>● Cenário 2: Edição com campos vazios</w:t>
+      </w:r>
+    </w:p>
+    <w:p>
+      <w:pPr>
+        <w:pStyle w:val="Ttulo3"/>
+        <w:keepNext w:val="0"/>
+        <w:keepLines w:val="0"/>
+        <w:spacing w:before="0"/>
+        <w:ind w:left="1440"/>
+        <w:rPr>
+          <w:b/>
+          <w:bCs/>
+          <w:color w:val="000000"/>
+          <w:sz w:val="26"/>
+          <w:szCs w:val="26"/>
+        </w:rPr>
+      </w:pPr>
+      <w:r>
+        <w:rPr>
+          <w:color w:val="000000"/>
+          <w:sz w:val="22"/>
+          <w:szCs w:val="22"/>
+        </w:rPr>
+        <w:lastRenderedPageBreak/>
+        <w:t>○ Dado que estou editando uma escola cadastrada</w:t>
+      </w:r>
+      <w:r>
+        <w:rPr>
+          <w:color w:val="000000"/>
+          <w:sz w:val="22"/>
+          <w:szCs w:val="22"/>
+        </w:rPr>
+        <w:br/>
+        <w:t>○ Quando removo o nome da escola</w:t>
+      </w:r>
+      <w:r>
+        <w:rPr>
+          <w:color w:val="000000"/>
+          <w:sz w:val="22"/>
+          <w:szCs w:val="22"/>
+        </w:rPr>
+        <w:br/>
+        <w:t>○ E clico em "Salvar"</w:t>
+      </w:r>
+      <w:r>
+        <w:rPr>
+          <w:color w:val="000000"/>
+          <w:sz w:val="22"/>
+          <w:szCs w:val="22"/>
+        </w:rPr>
+        <w:br/>
+        <w:t>○ Então o sistema deve impedir a atualização</w:t>
+      </w:r>
+      <w:r>
+        <w:rPr>
+          <w:color w:val="000000"/>
+          <w:sz w:val="22"/>
+          <w:szCs w:val="22"/>
+        </w:rPr>
+        <w:br/>
+        <w:t>○ E informar que os campos obrigatórios devem ser preenchidos</w:t>
+      </w:r>
+      <w:r>
+        <w:rPr>
+          <w:b/>
+          <w:bCs/>
+          <w:color w:val="000000"/>
+          <w:sz w:val="26"/>
+          <w:szCs w:val="26"/>
+        </w:rPr>
+        <w:t>.</w:t>
+      </w:r>
+    </w:p>
+    <w:p>
+      <w:pPr>
+        <w:pStyle w:val="Ttulo3"/>
+        <w:keepNext w:val="0"/>
+        <w:keepLines w:val="0"/>
+        <w:spacing w:before="0"/>
+        <w:rPr>
+          <w:b/>
+          <w:bCs/>
+          <w:color w:val="000000"/>
+          <w:sz w:val="26"/>
+          <w:szCs w:val="26"/>
+        </w:rPr>
+      </w:pPr>
+    </w:p>
+    <w:p>
+      <w:pPr>
+        <w:pStyle w:val="Ttulo3"/>
+        <w:keepNext w:val="0"/>
+        <w:keepLines w:val="0"/>
+        <w:spacing w:before="0"/>
+        <w:rPr>
+          <w:b/>
+          <w:bCs/>
+          <w:color w:val="000000"/>
+          <w:sz w:val="26"/>
+          <w:szCs w:val="26"/>
+        </w:rPr>
+      </w:pPr>
+      <w:r>
+        <w:rPr>
+          <w:b/>
+          <w:bCs/>
+          <w:color w:val="000000"/>
+          <w:sz w:val="26"/>
+          <w:szCs w:val="26"/>
+        </w:rPr>
+        <w:t>História de Usuário 06: Exclusão de Escolas</w:t>
+      </w:r>
+    </w:p>
+    <w:p>
+      <w:pPr>
+        <w:pStyle w:val="Ttulo3"/>
+        <w:keepNext w:val="0"/>
+        <w:keepLines w:val="0"/>
+        <w:spacing w:before="0"/>
+        <w:rPr>
+          <w:color w:val="000000"/>
+          <w:sz w:val="22"/>
+          <w:szCs w:val="22"/>
+        </w:rPr>
+      </w:pPr>
+      <w:r>
+        <w:rPr>
+          <w:color w:val="000000"/>
+          <w:sz w:val="22"/>
+          <w:szCs w:val="22"/>
+        </w:rPr>
+        <w:t>Como gestor autenticado,</w:t>
+      </w:r>
+      <w:r>
+        <w:rPr>
+          <w:color w:val="000000"/>
+          <w:sz w:val="22"/>
+          <w:szCs w:val="22"/>
+        </w:rPr>
+        <w:br/>
+        <w:t>Quero excluir instituições cadastradas,</w:t>
+      </w:r>
+      <w:r>
+        <w:rPr>
+          <w:color w:val="000000"/>
+          <w:sz w:val="22"/>
+          <w:szCs w:val="22"/>
+        </w:rPr>
+        <w:br/>
+        <w:t>Para que registros desnecessários sejam removidos do sistema.</w:t>
+      </w:r>
+    </w:p>
+    <w:p>
+      <w:pPr>
+        <w:pStyle w:val="Ttulo3"/>
+        <w:keepNext w:val="0"/>
+        <w:keepLines w:val="0"/>
+        <w:spacing w:before="0"/>
+        <w:rPr>
+          <w:b/>
+          <w:bCs/>
+          <w:color w:val="000000"/>
+          <w:sz w:val="22"/>
+          <w:szCs w:val="22"/>
+        </w:rPr>
+      </w:pPr>
+      <w:r>
+        <w:rPr>
+          <w:b/>
+          <w:bCs/>
+          <w:color w:val="000000"/>
+          <w:sz w:val="22"/>
+          <w:szCs w:val="22"/>
+        </w:rPr>
+        <w:t>Cenários em BDD:</w:t>
+      </w:r>
+    </w:p>
+    <w:p>
+      <w:pPr>
+        <w:pStyle w:val="Ttulo3"/>
+        <w:keepNext w:val="0"/>
+        <w:keepLines w:val="0"/>
+        <w:spacing w:before="0"/>
+        <w:ind w:left="720"/>
+        <w:rPr>
+          <w:b/>
+          <w:bCs/>
+          <w:color w:val="000000"/>
+          <w:sz w:val="22"/>
+          <w:szCs w:val="22"/>
+        </w:rPr>
+      </w:pPr>
+    </w:p>
+    <w:p>
+      <w:pPr>
+        <w:pStyle w:val="Ttulo3"/>
+        <w:keepNext w:val="0"/>
+        <w:keepLines w:val="0"/>
+        <w:spacing w:before="0"/>
+        <w:ind w:left="720"/>
+        <w:rPr>
+          <w:b/>
+          <w:bCs/>
+          <w:color w:val="000000"/>
+          <w:sz w:val="22"/>
+          <w:szCs w:val="22"/>
+        </w:rPr>
+      </w:pPr>
+      <w:r>
+        <w:rPr>
+          <w:b/>
+          <w:bCs/>
+          <w:color w:val="000000"/>
+          <w:sz w:val="22"/>
+          <w:szCs w:val="22"/>
+        </w:rPr>
+        <w:t>● Cenário 1: Exclusão confirmada</w:t>
+      </w:r>
+    </w:p>
+    <w:p>
+      <w:pPr>
+        <w:pStyle w:val="Ttulo3"/>
+        <w:keepNext w:val="0"/>
+        <w:keepLines w:val="0"/>
+        <w:spacing w:before="0"/>
+        <w:ind w:left="1440"/>
+        <w:rPr>
+          <w:color w:val="000000"/>
+          <w:sz w:val="22"/>
+          <w:szCs w:val="22"/>
+        </w:rPr>
+      </w:pPr>
+      <w:r>
+        <w:rPr>
+          <w:color w:val="000000"/>
+          <w:sz w:val="22"/>
+          <w:szCs w:val="22"/>
+        </w:rPr>
+        <w:t>○ Dado que estou autenticado no sistema</w:t>
+      </w:r>
+      <w:r>
+        <w:rPr>
+          <w:color w:val="000000"/>
+          <w:sz w:val="22"/>
+          <w:szCs w:val="22"/>
+        </w:rPr>
+        <w:br/>
+        <w:t>○ E existe uma escola cadastrada chamada "Escola Classe 01"</w:t>
+      </w:r>
+      <w:r>
+        <w:rPr>
+          <w:color w:val="000000"/>
+          <w:sz w:val="22"/>
+          <w:szCs w:val="22"/>
+        </w:rPr>
+        <w:br/>
+        <w:t>○ Quando clico no botão "Excluir"</w:t>
+      </w:r>
+      <w:r>
+        <w:rPr>
+          <w:color w:val="000000"/>
+          <w:sz w:val="22"/>
+          <w:szCs w:val="22"/>
+        </w:rPr>
+        <w:br/>
+        <w:t>○ E confirmo a exclusão</w:t>
+      </w:r>
+      <w:r>
+        <w:rPr>
+          <w:color w:val="000000"/>
+          <w:sz w:val="22"/>
+          <w:szCs w:val="22"/>
+        </w:rPr>
+        <w:br/>
+        <w:t>○ Então o sistema deve remover a escola da listagem.</w:t>
+      </w:r>
+    </w:p>
+    <w:p>
+      <w:pPr>
+        <w:pStyle w:val="Ttulo3"/>
+        <w:keepNext w:val="0"/>
+        <w:keepLines w:val="0"/>
+        <w:spacing w:before="0"/>
+        <w:ind w:left="720"/>
+        <w:rPr>
+          <w:color w:val="000000"/>
+          <w:sz w:val="22"/>
+          <w:szCs w:val="22"/>
+        </w:rPr>
+      </w:pPr>
+    </w:p>
+    <w:p>
+      <w:pPr>
+        <w:pStyle w:val="Ttulo3"/>
+        <w:keepNext w:val="0"/>
+        <w:keepLines w:val="0"/>
+        <w:spacing w:before="0"/>
+        <w:ind w:left="720"/>
+        <w:rPr>
+          <w:b/>
+          <w:bCs/>
+          <w:color w:val="000000"/>
+          <w:sz w:val="22"/>
+          <w:szCs w:val="22"/>
+        </w:rPr>
+      </w:pPr>
+      <w:r>
+        <w:rPr>
+          <w:b/>
+          <w:bCs/>
+          <w:color w:val="000000"/>
+          <w:sz w:val="22"/>
+          <w:szCs w:val="22"/>
+        </w:rPr>
+        <w:t>● Cenário 2: Cancelamento da exclusão</w:t>
+      </w:r>
+    </w:p>
+    <w:p>
+      <w:pPr>
+        <w:pStyle w:val="Ttulo3"/>
+        <w:keepNext w:val="0"/>
+        <w:keepLines w:val="0"/>
+        <w:spacing w:before="0"/>
+        <w:ind w:left="1440"/>
+        <w:rPr>
+          <w:color w:val="000000"/>
+          <w:sz w:val="22"/>
+          <w:szCs w:val="22"/>
+        </w:rPr>
+      </w:pPr>
+      <w:r>
+        <w:rPr>
+          <w:color w:val="000000"/>
+          <w:sz w:val="22"/>
+          <w:szCs w:val="22"/>
+        </w:rPr>
+        <w:t>○ Dado que estou autenticado no sistema</w:t>
+      </w:r>
+      <w:r>
+        <w:rPr>
+          <w:color w:val="000000"/>
+          <w:sz w:val="22"/>
+          <w:szCs w:val="22"/>
+        </w:rPr>
+        <w:br/>
+        <w:t>○ E existe uma escola cadastrada</w:t>
+      </w:r>
+      <w:r>
+        <w:rPr>
+          <w:color w:val="000000"/>
+          <w:sz w:val="22"/>
+          <w:szCs w:val="22"/>
+        </w:rPr>
+        <w:br/>
+        <w:t>○ Quando clico em "Excluir"</w:t>
+      </w:r>
+      <w:r>
+        <w:rPr>
+          <w:color w:val="000000"/>
+          <w:sz w:val="22"/>
+          <w:szCs w:val="22"/>
+        </w:rPr>
+        <w:br/>
+        <w:t>○ E cancelo a operação</w:t>
+      </w:r>
+      <w:r>
+        <w:rPr>
+          <w:color w:val="000000"/>
+          <w:sz w:val="22"/>
+          <w:szCs w:val="22"/>
+        </w:rPr>
+        <w:br/>
+        <w:t>○ Então o sistema não deve excluir a escola da listagem.</w:t>
+      </w:r>
+    </w:p>
+    <w:p>
+      <w:pPr>
+        <w:pStyle w:val="Ttulo3"/>
+        <w:keepNext w:val="0"/>
+        <w:keepLines w:val="0"/>
+        <w:spacing w:before="0"/>
+        <w:rPr>
+          <w:b/>
+          <w:bCs/>
+          <w:color w:val="000000"/>
+          <w:sz w:val="26"/>
+          <w:szCs w:val="26"/>
+        </w:rPr>
+      </w:pPr>
+    </w:p>
+    <w:p>
+      <w:pPr>
+        <w:pStyle w:val="Ttulo3"/>
+        <w:keepNext w:val="0"/>
+        <w:keepLines w:val="0"/>
+        <w:spacing w:before="0"/>
+        <w:rPr>
+          <w:b/>
+          <w:bCs/>
+          <w:color w:val="000000"/>
+          <w:sz w:val="26"/>
+          <w:szCs w:val="26"/>
+        </w:rPr>
+      </w:pPr>
+      <w:r>
+        <w:rPr>
+          <w:b/>
+          <w:bCs/>
+          <w:color w:val="000000"/>
+          <w:sz w:val="26"/>
+          <w:szCs w:val="26"/>
+        </w:rPr>
+        <w:t>História de Usuário 07: Segurança das Senhas</w:t>
+      </w:r>
+    </w:p>
+    <w:p>
+      <w:pPr>
+        <w:pStyle w:val="Ttulo3"/>
+        <w:keepNext w:val="0"/>
+        <w:keepLines w:val="0"/>
+        <w:spacing w:before="0"/>
+        <w:rPr>
+          <w:color w:val="000000"/>
+          <w:sz w:val="22"/>
+          <w:szCs w:val="22"/>
+        </w:rPr>
+      </w:pPr>
+      <w:r>
+        <w:rPr>
+          <w:color w:val="000000"/>
+          <w:sz w:val="22"/>
+          <w:szCs w:val="22"/>
+        </w:rPr>
+        <w:t>Como administrador do sistema,</w:t>
+      </w:r>
+      <w:r>
+        <w:rPr>
+          <w:color w:val="000000"/>
+          <w:sz w:val="22"/>
+          <w:szCs w:val="22"/>
+        </w:rPr>
+        <w:br/>
+        <w:t>Quero que as senhas dos usuários sejam armazenadas de forma segura,</w:t>
+      </w:r>
+      <w:r>
+        <w:rPr>
+          <w:color w:val="000000"/>
+          <w:sz w:val="22"/>
+          <w:szCs w:val="22"/>
+        </w:rPr>
+        <w:br/>
+        <w:t>Para que os dados de acesso permaneçam protegidos.</w:t>
+      </w:r>
+    </w:p>
+    <w:p>
+      <w:pPr>
+        <w:pStyle w:val="Ttulo3"/>
+        <w:keepNext w:val="0"/>
+        <w:keepLines w:val="0"/>
+        <w:spacing w:before="0"/>
+        <w:rPr>
+          <w:b/>
+          <w:bCs/>
+          <w:color w:val="000000"/>
+          <w:sz w:val="22"/>
+          <w:szCs w:val="22"/>
+        </w:rPr>
+      </w:pPr>
+      <w:r>
+        <w:rPr>
+          <w:b/>
+          <w:bCs/>
+          <w:color w:val="000000"/>
+          <w:sz w:val="22"/>
+          <w:szCs w:val="22"/>
+        </w:rPr>
+        <w:t>Cenários em BDD:</w:t>
+      </w:r>
+    </w:p>
+    <w:p>
+      <w:pPr>
+        <w:pStyle w:val="Ttulo3"/>
+        <w:keepNext w:val="0"/>
+        <w:keepLines w:val="0"/>
+        <w:spacing w:before="0"/>
+        <w:ind w:left="720"/>
+        <w:rPr>
+          <w:b/>
+          <w:bCs/>
+          <w:color w:val="000000"/>
+          <w:sz w:val="22"/>
+          <w:szCs w:val="22"/>
+        </w:rPr>
+      </w:pPr>
+      <w:r>
+        <w:rPr>
+          <w:b/>
+          <w:bCs/>
+          <w:color w:val="000000"/>
+          <w:sz w:val="22"/>
+          <w:szCs w:val="22"/>
+        </w:rPr>
+        <w:t>● Cenário 1: Criptografia da senha no cadastro</w:t>
+      </w:r>
+    </w:p>
+    <w:p>
+      <w:pPr>
+        <w:pStyle w:val="Ttulo3"/>
+        <w:keepNext w:val="0"/>
+        <w:keepLines w:val="0"/>
+        <w:spacing w:before="0"/>
+        <w:ind w:left="1440"/>
+        <w:rPr>
+          <w:color w:val="000000"/>
+          <w:sz w:val="22"/>
+          <w:szCs w:val="22"/>
+        </w:rPr>
+      </w:pPr>
+      <w:r>
+        <w:rPr>
+          <w:color w:val="000000"/>
+          <w:sz w:val="22"/>
+          <w:szCs w:val="22"/>
+        </w:rPr>
+        <w:t>○ Dado que um novo usuário realiza cadastro no sistema</w:t>
+      </w:r>
+      <w:r>
+        <w:rPr>
+          <w:color w:val="000000"/>
+          <w:sz w:val="22"/>
+          <w:szCs w:val="22"/>
+        </w:rPr>
+        <w:br/>
+      </w:r>
+      <w:proofErr w:type="gramStart"/>
+      <w:r>
+        <w:rPr>
+          <w:color w:val="000000"/>
+          <w:sz w:val="22"/>
+          <w:szCs w:val="22"/>
+        </w:rPr>
+        <w:t>○ Quando</w:t>
+      </w:r>
+      <w:proofErr w:type="gramEnd"/>
+      <w:r>
+        <w:rPr>
+          <w:color w:val="000000"/>
+          <w:sz w:val="22"/>
+          <w:szCs w:val="22"/>
+        </w:rPr>
+        <w:t xml:space="preserve"> a conta é criada</w:t>
+      </w:r>
+      <w:r>
+        <w:rPr>
+          <w:color w:val="000000"/>
+          <w:sz w:val="22"/>
+          <w:szCs w:val="22"/>
+        </w:rPr>
+        <w:br/>
+      </w:r>
+      <w:proofErr w:type="gramStart"/>
+      <w:r>
+        <w:rPr>
+          <w:color w:val="000000"/>
+          <w:sz w:val="22"/>
+          <w:szCs w:val="22"/>
+        </w:rPr>
+        <w:t>○ Então</w:t>
+      </w:r>
+      <w:proofErr w:type="gramEnd"/>
+      <w:r>
+        <w:rPr>
+          <w:color w:val="000000"/>
+          <w:sz w:val="22"/>
+          <w:szCs w:val="22"/>
+        </w:rPr>
+        <w:t xml:space="preserve"> o sistema deve armazenar a senha utilizando criptografia </w:t>
+      </w:r>
+      <w:proofErr w:type="spellStart"/>
+      <w:r>
+        <w:rPr>
+          <w:color w:val="000000"/>
+          <w:sz w:val="22"/>
+          <w:szCs w:val="22"/>
+        </w:rPr>
+        <w:t>BCrypt</w:t>
+      </w:r>
+      <w:proofErr w:type="spellEnd"/>
+      <w:r>
+        <w:rPr>
+          <w:color w:val="000000"/>
+          <w:sz w:val="22"/>
+          <w:szCs w:val="22"/>
+        </w:rPr>
+        <w:t>.</w:t>
+      </w:r>
+    </w:p>
+    <w:p>
+      <w:pPr>
+        <w:pStyle w:val="Ttulo3"/>
+        <w:keepNext w:val="0"/>
+        <w:keepLines w:val="0"/>
+        <w:spacing w:before="0"/>
+        <w:ind w:left="720"/>
+        <w:rPr>
+          <w:b/>
+          <w:bCs/>
+          <w:color w:val="000000"/>
+          <w:sz w:val="22"/>
+          <w:szCs w:val="22"/>
+        </w:rPr>
+      </w:pPr>
+      <w:r>
+        <w:rPr>
+          <w:b/>
+          <w:bCs/>
+          <w:color w:val="000000"/>
+          <w:sz w:val="22"/>
+          <w:szCs w:val="22"/>
+        </w:rPr>
+        <w:t>● Cenário 2: Validação de senha criptografada no login</w:t>
+      </w:r>
+    </w:p>
+    <w:p>
+      <w:pPr>
+        <w:pStyle w:val="Ttulo3"/>
+        <w:keepNext w:val="0"/>
+        <w:keepLines w:val="0"/>
+        <w:spacing w:before="0"/>
+        <w:ind w:left="1440"/>
+        <w:rPr>
+          <w:color w:val="000000"/>
+          <w:sz w:val="22"/>
+          <w:szCs w:val="22"/>
+        </w:rPr>
+      </w:pPr>
+      <w:r>
+        <w:rPr>
+          <w:color w:val="000000"/>
+          <w:sz w:val="22"/>
+          <w:szCs w:val="22"/>
+        </w:rPr>
+        <w:t>○ Dado que existe um usuário cadastrado com senha criptografada</w:t>
+      </w:r>
+      <w:r>
+        <w:rPr>
+          <w:color w:val="000000"/>
+          <w:sz w:val="22"/>
+          <w:szCs w:val="22"/>
+        </w:rPr>
+        <w:br/>
+      </w:r>
+      <w:proofErr w:type="gramStart"/>
+      <w:r>
+        <w:rPr>
+          <w:color w:val="000000"/>
+          <w:sz w:val="22"/>
+          <w:szCs w:val="22"/>
+        </w:rPr>
+        <w:t>○ Quando</w:t>
+      </w:r>
+      <w:proofErr w:type="gramEnd"/>
+      <w:r>
+        <w:rPr>
+          <w:color w:val="000000"/>
+          <w:sz w:val="22"/>
+          <w:szCs w:val="22"/>
+        </w:rPr>
+        <w:t xml:space="preserve"> o usuário realiza login com a senha correta</w:t>
+      </w:r>
+      <w:r>
+        <w:rPr>
+          <w:color w:val="000000"/>
+          <w:sz w:val="22"/>
+          <w:szCs w:val="22"/>
+        </w:rPr>
+        <w:br/>
+      </w:r>
+      <w:proofErr w:type="gramStart"/>
+      <w:r>
+        <w:rPr>
+          <w:color w:val="000000"/>
+          <w:sz w:val="22"/>
+          <w:szCs w:val="22"/>
+        </w:rPr>
+        <w:t>○ Então</w:t>
+      </w:r>
+      <w:proofErr w:type="gramEnd"/>
+      <w:r>
+        <w:rPr>
+          <w:color w:val="000000"/>
+          <w:sz w:val="22"/>
+          <w:szCs w:val="22"/>
+        </w:rPr>
+        <w:t xml:space="preserve"> o sistema deve validar a senha utilizando comparação </w:t>
+      </w:r>
+      <w:proofErr w:type="spellStart"/>
+      <w:r>
+        <w:rPr>
+          <w:color w:val="000000"/>
+          <w:sz w:val="22"/>
+          <w:szCs w:val="22"/>
+        </w:rPr>
+        <w:t>BCrypt</w:t>
+      </w:r>
+      <w:proofErr w:type="spellEnd"/>
+      <w:r>
+        <w:rPr>
+          <w:color w:val="000000"/>
+          <w:sz w:val="22"/>
+          <w:szCs w:val="22"/>
+        </w:rPr>
+        <w:br/>
+        <w:t>○ E permitir o acesso ao sistema.</w:t>
+      </w:r>
+    </w:p>
+    <w:p>
+      <w:pPr>
+        <w:spacing w:after="240"/>
+      </w:pPr>
+    </w:p>
     <w:p/>
     <w:p>
       <w:pPr>
@@ -4800,7 +6451,6 @@
           <w:b/>
           <w:bCs/>
         </w:rPr>
-        <w:lastRenderedPageBreak/>
         <w:t>Estratégia:</w:t>
       </w:r>
       <w:r>
@@ -5453,6 +7103,7 @@
                 <w:b/>
                 <w:bCs/>
               </w:rPr>
+              <w:lastRenderedPageBreak/>
               <w:t>CT-04</w:t>
             </w:r>
           </w:p>
@@ -5723,7 +7374,6 @@
         <w:spacing w:after="240"/>
       </w:pPr>
       <w:r>
-        <w:lastRenderedPageBreak/>
         <w:t>Todos os testes planejados foram executados com sucesso em ambiente de desenvolvimento local, confirmando que o sistema atende aos critérios de aceitação estipulados. Não foram encontrados bugs críticos ("</w:t>
       </w:r>
       <w:proofErr w:type="spellStart"/>
@@ -5857,6 +7507,7 @@
           <w:iCs/>
           <w:noProof/>
         </w:rPr>
+        <w:lastRenderedPageBreak/>
         <w:drawing>
           <wp:inline distT="114300" distB="114300" distL="114300" distR="114300" wp14:anchorId="20438720" wp14:editId="59A3A24D">
             <wp:extent cx="5731200" cy="1612900"/>
@@ -5934,7 +7585,6 @@
         <w:rPr>
           <w:noProof/>
         </w:rPr>
-        <w:lastRenderedPageBreak/>
         <w:drawing>
           <wp:inline distT="114300" distB="114300" distL="114300" distR="114300" wp14:anchorId="75964F58" wp14:editId="226EC7F9">
             <wp:extent cx="5731200" cy="2641600"/>
@@ -6068,6 +7718,7 @@
           <w:sz w:val="34"/>
           <w:szCs w:val="34"/>
         </w:rPr>
+        <w:lastRenderedPageBreak/>
         <w:t>7. Link para o Repositório</w:t>
       </w:r>
     </w:p>
@@ -7465,6 +9116,22 @@
       <w:spacing w:line="240" w:lineRule="auto"/>
     </w:pPr>
   </w:style>
+  <w:style w:type="paragraph" w:styleId="NormalWeb">
+    <w:name w:val="Normal (Web)"/>
+    <w:basedOn w:val="Normal"/>
+    <w:uiPriority w:val="99"/>
+    <w:semiHidden/>
+    <w:unhideWhenUsed/>
+    <w:rsid w:val="007958AA"/>
+    <w:pPr>
+      <w:spacing w:before="100" w:beforeAutospacing="1" w:after="100" w:afterAutospacing="1" w:line="240" w:lineRule="auto"/>
+    </w:pPr>
+    <w:rPr>
+      <w:rFonts w:ascii="Times New Roman" w:eastAsia="Times New Roman" w:hAnsi="Times New Roman" w:cs="Times New Roman"/>
+      <w:sz w:val="24"/>
+      <w:szCs w:val="24"/>
+    </w:rPr>
+  </w:style>
 </w:styles>
 </file>
 

</xml_diff>